<commit_message>
Enforce default black font color in thesis skill
</commit_message>
<xml_diff>
--- a/ujs-thesis-format/assets/ujs-thesis-template.docx
+++ b/ujs-thesis-format/assets/ujs-thesis-template.docx
@@ -26,6 +26,7 @@
         <w:rPr>
           <w:rFonts w:ascii="Times New Roman" w:hAnsi="Times New Roman" w:eastAsia="FangSong"/>
           <w:b w:val="0"/>
+          <w:color w:val="000000"/>
           <w:sz w:val="24"/>
         </w:rPr>
         <w:t>学院：</w:t>
@@ -39,6 +40,7 @@
         <w:rPr>
           <w:rFonts w:ascii="Times New Roman" w:hAnsi="Times New Roman" w:eastAsia="FangSong"/>
           <w:b w:val="0"/>
+          <w:color w:val="000000"/>
           <w:sz w:val="24"/>
         </w:rPr>
         <w:t>专业班级：</w:t>
@@ -52,6 +54,7 @@
         <w:rPr>
           <w:rFonts w:ascii="Times New Roman" w:hAnsi="Times New Roman" w:eastAsia="FangSong"/>
           <w:b w:val="0"/>
+          <w:color w:val="000000"/>
           <w:sz w:val="24"/>
         </w:rPr>
         <w:t>学生姓名：</w:t>
@@ -65,6 +68,7 @@
         <w:rPr>
           <w:rFonts w:ascii="Times New Roman" w:hAnsi="Times New Roman" w:eastAsia="FangSong"/>
           <w:b w:val="0"/>
+          <w:color w:val="000000"/>
           <w:sz w:val="24"/>
         </w:rPr>
         <w:t>指导教师：</w:t>
@@ -78,6 +82,7 @@
         <w:rPr>
           <w:rFonts w:ascii="Times New Roman" w:hAnsi="Times New Roman" w:eastAsia="FangSong"/>
           <w:b w:val="0"/>
+          <w:color w:val="000000"/>
           <w:sz w:val="24"/>
         </w:rPr>
         <w:t>指导教师职称：</w:t>
@@ -91,6 +96,7 @@
         <w:rPr>
           <w:rFonts w:ascii="Times New Roman" w:hAnsi="Times New Roman" w:eastAsia="FangSong"/>
           <w:b w:val="0"/>
+          <w:color w:val="000000"/>
           <w:sz w:val="24"/>
         </w:rPr>
         <w:t>时间：</w:t>
@@ -330,6 +336,7 @@
       <w:rPr>
         <w:rFonts w:ascii="Times New Roman" w:hAnsi="Times New Roman" w:eastAsia="Times New Roman"/>
         <w:b w:val="0"/>
+        <w:color w:val="000000"/>
         <w:sz w:val="20"/>
       </w:rPr>
       <w:fldChar w:fldCharType="separate"/>
@@ -338,6 +345,7 @@
       <w:rPr>
         <w:rFonts w:ascii="Times New Roman" w:hAnsi="Times New Roman" w:eastAsia="Times New Roman"/>
         <w:b w:val="0"/>
+        <w:color w:val="000000"/>
         <w:sz w:val="20"/>
       </w:rPr>
       <w:t>1</w:t>
@@ -364,6 +372,7 @@
       <w:rPr>
         <w:rFonts w:ascii="Times New Roman" w:hAnsi="Times New Roman" w:eastAsia="SimHei"/>
         <w:b/>
+        <w:color w:val="000000"/>
         <w:sz w:val="21"/>
       </w:rPr>
       <w:t>江苏大学本科毕业设计（论文）</w:t>
@@ -742,6 +751,7 @@
     <w:rPr>
       <w:rFonts w:ascii="Times New Roman" w:hAnsi="Times New Roman" w:eastAsia="FangSong"/>
       <w:b w:val="0"/>
+      <w:color w:val="000000"/>
       <w:sz w:val="24"/>
     </w:rPr>
   </w:style>

</xml_diff>